<commit_message>
feat: round 23 - PPT Master v6.4.0 deck (12 pages, native DrawingML) + SVG sources + build record + manifest now declares 7 artifacts
Co-authored-by: arena-agent <297053741+arena-agent@users.noreply.github.com>
</commit_message>
<xml_diff>
--- a/deliverable/DELIVERY_01a0aa00_v2.8.1.docx
+++ b/deliverable/DELIVERY_01a0aa00_v2.8.1.docx
@@ -18,6 +18,11 @@
     <w:p>
       <w:r>
         <w:t>这一轮（自循环的最后一步）不再生成新内容，只把"交付了什么、本机怎么判的、在本机哪里取"列成一张可核对的清单；哈希与构件数和 deliverable/OFFICE_HASHES.json 一致。</w:t>
+      </w:r>
+    </w:p>
+    <w:p>
+      <w:r>
+        <w:t>内容是动态生成的：清单里的每一行就是 deliverable/OFFICE_HASHES.json 里的一项，本机按同一份清单逐项判定（sha256、OOXML 部件、XML、关系、内容类型、标记词、页数，真 Office 开档）。</w:t>
       </w:r>
     </w:p>
     <w:p>
@@ -250,10 +255,52 @@
           </w:p>
         </w:tc>
       </w:tr>
+      <w:tr>
+        <w:tc>
+          <w:tcPr>
+            <w:tcW w:type="dxa" w:w="2160"/>
+          </w:tcPr>
+          <w:p>
+            <w:r>
+              <w:t>deliverable/DECK_01a0aa00_v2.8.1.pptx</w:t>
+            </w:r>
+          </w:p>
+        </w:tc>
+        <w:tc>
+          <w:tcPr>
+            <w:tcW w:type="dxa" w:w="2160"/>
+          </w:tcPr>
+          <w:p>
+            <w:r>
+              <w:t>pptx</w:t>
+            </w:r>
+          </w:p>
+        </w:tc>
+        <w:tc>
+          <w:tcPr>
+            <w:tcW w:type="dxa" w:w="2160"/>
+          </w:tcPr>
+          <w:p>
+            <w:r>
+              <w:t>46582</w:t>
+            </w:r>
+          </w:p>
+        </w:tc>
+        <w:tc>
+          <w:tcPr>
+            <w:tcW w:type="dxa" w:w="2160"/>
+          </w:tcPr>
+          <w:p>
+            <w:r>
+              <w:t>0c2ff1af1f798df5</w:t>
+            </w:r>
+          </w:p>
+        </w:tc>
+      </w:tr>
     </w:tbl>
     <w:p>
       <w:r>
-        <w:t>生成器：code/make_bridge_report.py（build 四个内容文件 + 本清单；跑完先在沙箱里过同一套 3a-3g 的 Python 镜像自检，再交本机判定）。</w:t>
+        <w:t>生成器：code/make_bridge_report.py（报告与清单，docx/pptx）与 code/make_deck_pptmaster.py（本清单里的 DECK，12 页，走 PPT Master 的 SVG → 原生 DrawingML 流水线）。两者都会先在沙箱里过同一套 3a-3g 的 Python 镜像自检，再交本机判定。</w:t>
       </w:r>
     </w:p>
     <w:p>
@@ -262,14 +309,6 @@
       </w:pPr>
       <w:r>
         <w:t>2. 本机回执（真机判定）</w:t>
-      </w:r>
-    </w:p>
-    <w:p>
-      <w:pPr>
-        <w:pStyle w:val="ListBullet"/>
-      </w:pPr>
-      <w:r>
-        <w:t>round 18 on LAPTOP-R77M5D6M - passed（exit 0，12s）  日志：results/status/check_r18_20260916-110247.txt</w:t>
       </w:r>
     </w:p>
     <w:p>
@@ -286,6 +325,14 @@
       </w:pPr>
       <w:r>
         <w:t>round 21 on LAPTOP-R77M5D6M - passed（exit 0，34s）  日志：results/status/check_r21_20260916-194812.txt</w:t>
+      </w:r>
+    </w:p>
+    <w:p>
+      <w:pPr>
+        <w:pStyle w:val="ListBullet"/>
+      </w:pPr>
+      <w:r>
+        <w:t>round 22 on LAPTOP-R77M5D6M - passed（exit 0，43s）  日志：results/status/check_r22_20260916-195058.txt</w:t>
       </w:r>
     </w:p>
     <w:p>
@@ -317,7 +364,15 @@
         <w:pStyle w:val="ListBullet"/>
       </w:pPr>
       <w:r>
-        <w:t>2b-2d：值守三行/收尾行齐全、hands-free auto_pull/auto_push 都在；成功标准 54 条全过、0 fail</w:t>
+        <w:t>2b-2d：值守三行/收尾行齐全、hands-free auto_pull/auto_push 都在；成功标准逐条全过、0 fail</w:t>
+      </w:r>
+    </w:p>
+    <w:p>
+      <w:pPr>
+        <w:pStyle w:val="ListBullet"/>
+      </w:pPr>
+      <w:r>
+        <w:t>本轮（DECK 加入后）本机判定的是上表全部 5 份产物——结论见 results/status/handshake.json</w:t>
       </w:r>
     </w:p>
     <w:p>
@@ -349,7 +404,7 @@
         <w:pStyle w:val="ListBullet"/>
       </w:pPr>
       <w:r>
-        <w:t>或直接打开克隆目录里的 deliverable\（四份 Office 文件 + 清单 OFFICE_HASHES.json 就在里面）</w:t>
+        <w:t>或直接打开克隆目录里的 deliverable\（上表全部文件 + 清单 OFFICE_HASHES.json 就在里面）</w:t>
       </w:r>
     </w:p>
     <w:p>
@@ -437,7 +492,15 @@
         <w:pStyle w:val="ListBullet"/>
       </w:pPr>
       <w:r>
-        <w:t>本轮（收尾）：把上面两轮的结果与清单固化成本文件（DELIVERY），同样推给本机判定</w:t>
+        <w:t>round 22：把前两轮的结果与清单固化成 DELIVERY，同样交本机判定</w:t>
+      </w:r>
+    </w:p>
+    <w:p>
+      <w:pPr>
+        <w:pStyle w:val="ListBullet"/>
+      </w:pPr>
+      <w:r>
+        <w:t>round 23：用 PPT Master v6.4.0 重新生成 12 页 DECK（先写 SVG 设计稿，再由它的导出器编译成原生 DrawingML 形状），7 份产物一起交本机判定</w:t>
       </w:r>
     </w:p>
     <w:p>

</xml_diff>